<commit_message>
Italicize BCAP abbreviation throughout v2 + feature v2 in README
- v2.docx: italicize all 22 occurrences of the "BCAP" abbreviation
  (Bluebook Rule 4.2(b) — shortened form retains italics of the full
  italicized title). Previously only the full title was italic; the
  abbreviation in §1.4 + §3.4/§3.5/§6.1 cross-references was plain.
  v2.docx italic-run count: 48 (1 caption + 47 phrase italicizations
  across case names, book/internet-source titles, citation signals,
  and the BCAP abbreviation).
- README.md: add "Second Edition · May 2026" label at top; restructure
  Downloads section to feature v2 as current with v1 archive preserved
  as citation anchor.
- _build_v2_xml.ps1: Italicize-Phrase now loops with skip-if-already-
  italic to handle multiple occurrences of a phrase per paragraph
  (needed because §1.4 has 18+ BCAP references in single-run paragraphs).
</commit_message>
<xml_diff>
--- a/consensus_change_standards_v2.docx
+++ b/consensus_change_standards_v2.docx
@@ -738,51 +738,7 @@
         <w:rPr>
           <w:color w:val="333333"/>
         </w:rPr>
-        <w:t xml:space="preserve"> (Nov. 2024) [hereinafter BCAP]. BCAP categorizes participants in consensus changes into six stakeholder groups — Economic Nodes, Investors, Media Influencers, Miners, Protocol Developers, and Users/Application Developers — and analyzes how the relative power of each group fluctuates across the phases of a proposal’s lifecycle. It introduces a “State of Mind” framework distinguishing degrees of stakeholder engagement, develops a detailed scenario analysis of consensus changes deployed through alternative clients, and concludes with thirteen evaluation questions and twelve indicators stakeholders may use to assess proposals in real time. BCAP’s draft was reviewed by a substantial cross-section of Bitcoin’s protocol-development and analytical community.</w:t>
-      </w:r>
-    </w:p>
-    <w:p>
-      <w:pPr>
-        <w:jc w:val="both"/>
-      </w:pPr>
-      <w:r>
-        <w:rPr>
-          <w:color w:val="333333"/>
-        </w:rPr>
-        <w:t xml:space="preserve">BCAP and the present framework address the same problem from different vantages. BCAP is descriptive: it explains how Bitcoin consensus emerges from the iterated interactions of stakeholders with shifting powers and divergent incentives. This paper is normative: it proposes the minimum standards a proposal should meet before stakeholders rationally engage with its activation. The two works converge on several substantive points. Both treat sub-overwhelming Economic Node adoption as the central failure mode in contested soft-fork scenarios — BCAP through its bounty-claim and chain-split risk analysis (§3.5.2), this paper through its activation-threshold standards (§3.4) and chain-split risk-assessment requirement (§3.5). Both treat miner signaling as a necessary but insufficient indicator of community consensus. Both reject naïve majoritarianism as a consensus-determination heuristic. And both identify Economic-Node coordination as the operative remedy when an activation proceeds without genuine consensus: BCAP describes that coordination descriptively, as the mechanism by which markets re-equilibrate after a contested split; this paper prescribes it normatively, as the recommended response to a proposal classified as Red under §5.2.</w:t>
-      </w:r>
-    </w:p>
-    <w:p>
-      <w:pPr>
-        <w:jc w:val="both"/>
-      </w:pPr>
-      <w:r>
-        <w:rPr>
-          <w:color w:val="333333"/>
-        </w:rPr>
-        <w:t xml:space="preserve">This paper extends BCAP’s analytical framework in four respects. First, it operationalizes qualitative recommendations into numerical floors: minimum activation thresholds (90% MASF, with sub-80% presumptively dangerous and sub-60% reckless); minimum review periods tied to risk category (twelve months for moderate-risk soft forks, twenty-four months for high-risk soft forks, thirty-six for hard forks); and minimum testnet deployment duration (three months). Second, it quantifies the relationship between activation threshold and chain-split exposure: §3.4 models post-activation hashrate as a Bernoulli process and derives concrete reorganization probabilities — approximately thirty percent at E = 0.55 over a six-block horizon, falling to roughly 2×10⁻⁸ at E = 0.95. This quantification is consistent with BCAP’s qualitative conclusion that low and high Economic Node adoption produce categorically different risk profiles, but supplies the order-of-magnitude estimates that the qualitative analysis leaves open. Third, it develops a legal-liability framework — negligence (with explicit attention to the economic-loss rule and the available routes around it), tortious interference, fiduciary duty, mining-pool contract obligations, and regulatory consequences. BCAP does not address legal exposure; this paper offers it as a distinct analytical layer whose conclusions are relevant to every stakeholder group BCAP identifies. Fourth, it consolidates the foregoing into a binary twenty-point scoring rubric with classification bands (§5), enabling structured evaluation in place of free-form weighing of considerations.</w:t>
-      </w:r>
-    </w:p>
-    <w:p>
-      <w:pPr>
-        <w:jc w:val="both"/>
-      </w:pPr>
-      <w:r>
-        <w:rPr>
-          <w:color w:val="333333"/>
-        </w:rPr>
-        <w:t xml:space="preserve">Several elements of BCAP the present paper does not duplicate. The stakeholder taxonomy and the power-over-time analysis (BCAP §§3.2, 3.3.2), the State of Mind framework (BCAP §3.1), the investor-segment analysis distinguishing self-custodying holders from institutional, corporate-treasury, and exchange-traded-fund segments (BCAP §3.2.2), and the alternative-client adoption-pathway analysis (BCAP §3.5.1) all remain the more developed treatments of their respective subjects. This paper refers readers to BCAP for those questions. The two frameworks are intended to function together: BCAP supplies the theory of how stakeholders shape consensus; this paper supplies the standards by which stakeholders may judge whether a particular proposal is ready for that process to begin.</w:t>
-      </w:r>
-    </w:p>
-    <w:p>
-      <w:pPr>
-        <w:jc w:val="both"/>
-      </w:pPr>
-      <w:r>
-        <w:rPr>
-          <w:color w:val="333333"/>
-        </w:rPr>
-        <w:t xml:space="preserve">The minimum-review-period floors proposed in §3.2 are anchored in empirical observation rather than aesthetic preference. Jameson Lopp’s longitudinal analysis of Bitcoin Core node-software adoption documents median upgrade times measured in months — historically on the order of forty weeks for routine releases, with recent versions trending longer still. </w:t>
+        <w:t xml:space="preserve"> (Nov. 2024) [hereinafter </w:t>
       </w:r>
       <w:r>
         <w:rPr>
@@ -790,13 +746,13 @@
           <w:iCs/>
           <w:color w:val="333333"/>
         </w:rPr>
-        <w:t xml:space="preserve">See </w:t>
-      </w:r>
-      <w:r>
-        <w:rPr>
-          <w:color w:val="333333"/>
-        </w:rPr>
-        <w:t xml:space="preserve">Jameson Lopp, </w:t>
+        <w:t xml:space="preserve">BCAP</w:t>
+      </w:r>
+      <w:r>
+        <w:rPr>
+          <w:color w:val="333333"/>
+        </w:rPr>
+        <w:t xml:space="preserve">]. </w:t>
       </w:r>
       <w:r>
         <w:rPr>
@@ -804,24 +760,13 @@
           <w:iCs/>
           <w:color w:val="333333"/>
         </w:rPr>
-        <w:t xml:space="preserve">When Do Bitcoin Node Operators Upgrade?</w:t>
-      </w:r>
-      <w:r>
-        <w:rPr>
-          <w:color w:val="333333"/>
-        </w:rPr>
-        <w:t xml:space="preserve">, blog.lopp.net/when-do-bitcoin-node-operators-upgrade/. A twelve-month minimum review period for a moderate-risk soft fork accommodates a single such upgrade cycle plus a meaningful interval for review; a twenty-four-month minimum for a high-risk soft fork accommodates two. The review-period floors proposed in this framework are thus not arbitrary durations but the durations the network’s own observed upgrade dynamics require for activation signaling to begin from a position of broad enforcement readiness rather than speculative anticipation.</w:t>
-      </w:r>
-    </w:p>
-    <w:p>
-      <w:pPr>
-        <w:jc w:val="both"/>
-      </w:pPr>
-      <w:r>
-        <w:rPr>
-          <w:color w:val="333333"/>
-        </w:rPr>
-        <w:t xml:space="preserve">The legal analysis in Section 4 engages a smaller but distinct body of prior work. Angela Walch’s argument that core protocol developers exercise discretionary authority over property interests sufficient to trigger fiduciary obligations is the central academic contribution to the question and is engaged directly in the fiduciary-duty analysis below. The Tulip Trading litigation (</w:t>
+        <w:t xml:space="preserve">BCAP</w:t>
+      </w:r>
+      <w:r>
+        <w:rPr>
+          <w:color w:val="333333"/>
+        </w:rPr>
+        <w:t xml:space="preserve"> categorizes participants in consensus changes into six stakeholder groups — Economic Nodes, Investors, Media Influencers, Miners, Protocol Developers, and Users/Application Developers — and analyzes how the relative power of each group fluctuates across the phases of a proposal’s lifecycle. It introduces a “State of Mind” framework distinguishing degrees of stakeholder engagement, develops a detailed scenario analysis of consensus changes deployed through alternative clients, and concludes with thirteen evaluation questions and twelve indicators stakeholders may use to assess proposals in real time. </w:t>
       </w:r>
       <w:r>
         <w:rPr>
@@ -829,6 +774,313 @@
           <w:iCs/>
           <w:color w:val="333333"/>
         </w:rPr>
+        <w:t xml:space="preserve">BCAP</w:t>
+      </w:r>
+      <w:r>
+        <w:rPr>
+          <w:color w:val="333333"/>
+        </w:rPr>
+        <w:t xml:space="preserve">’s draft was reviewed by a substantial cross-section of Bitcoin’s protocol-development and analytical community.</w:t>
+      </w:r>
+    </w:p>
+    <w:p>
+      <w:pPr>
+        <w:jc w:val="both"/>
+      </w:pPr>
+      <w:r>
+        <w:rPr>
+          <w:color w:val="333333"/>
+        </w:rPr>
+        <w:t xml:space="preserve"/>
+      </w:r>
+      <w:r>
+        <w:rPr>
+          <w:i/>
+          <w:iCs/>
+          <w:color w:val="333333"/>
+        </w:rPr>
+        <w:t xml:space="preserve">BCAP</w:t>
+      </w:r>
+      <w:r>
+        <w:rPr>
+          <w:color w:val="333333"/>
+        </w:rPr>
+        <w:t xml:space="preserve"> and the present framework address the same problem from different vantages. </w:t>
+      </w:r>
+      <w:r>
+        <w:rPr>
+          <w:i/>
+          <w:iCs/>
+          <w:color w:val="333333"/>
+        </w:rPr>
+        <w:t xml:space="preserve">BCAP</w:t>
+      </w:r>
+      <w:r>
+        <w:rPr>
+          <w:color w:val="333333"/>
+        </w:rPr>
+        <w:t xml:space="preserve"> is descriptive: it explains how Bitcoin consensus emerges from the iterated interactions of stakeholders with shifting powers and divergent incentives. This paper is normative: it proposes the minimum standards a proposal should meet before stakeholders rationally engage with its activation. The two works converge on several substantive points. Both treat sub-overwhelming Economic Node adoption as the central failure mode in contested soft-fork scenarios — </w:t>
+      </w:r>
+      <w:r>
+        <w:rPr>
+          <w:i/>
+          <w:iCs/>
+          <w:color w:val="333333"/>
+        </w:rPr>
+        <w:t xml:space="preserve">BCAP</w:t>
+      </w:r>
+      <w:r>
+        <w:rPr>
+          <w:color w:val="333333"/>
+        </w:rPr>
+        <w:t xml:space="preserve"> through its bounty-claim and chain-split risk analysis (§3.5.2), this paper through its activation-threshold standards (§3.4) and chain-split risk-assessment requirement (§3.5). Both treat miner signaling as a necessary but insufficient indicator of community consensus. Both reject naïve majoritarianism as a consensus-determination heuristic. And both identify Economic-Node coordination as the operative remedy when an activation proceeds without genuine consensus: </w:t>
+      </w:r>
+      <w:r>
+        <w:rPr>
+          <w:i/>
+          <w:iCs/>
+          <w:color w:val="333333"/>
+        </w:rPr>
+        <w:t xml:space="preserve">BCAP</w:t>
+      </w:r>
+      <w:r>
+        <w:rPr>
+          <w:color w:val="333333"/>
+        </w:rPr>
+        <w:t xml:space="preserve"> describes that coordination descriptively, as the mechanism by which markets re-equilibrate after a contested split; this paper prescribes it normatively, as the recommended response to a proposal classified as Red under §5.2.</w:t>
+      </w:r>
+    </w:p>
+    <w:p>
+      <w:pPr>
+        <w:jc w:val="both"/>
+      </w:pPr>
+      <w:r>
+        <w:rPr>
+          <w:color w:val="333333"/>
+        </w:rPr>
+        <w:t xml:space="preserve">This paper extends </w:t>
+      </w:r>
+      <w:r>
+        <w:rPr>
+          <w:i/>
+          <w:iCs/>
+          <w:color w:val="333333"/>
+        </w:rPr>
+        <w:t xml:space="preserve">BCAP</w:t>
+      </w:r>
+      <w:r>
+        <w:rPr>
+          <w:color w:val="333333"/>
+        </w:rPr>
+        <w:t xml:space="preserve">’s analytical framework in four respects. First, it operationalizes qualitative recommendations into numerical floors: minimum activation thresholds (90% MASF, with sub-80% presumptively dangerous and sub-60% reckless); minimum review periods tied to risk category (twelve months for moderate-risk soft forks, twenty-four months for high-risk soft forks, thirty-six for hard forks); and minimum testnet deployment duration (three months). Second, it quantifies the relationship between activation threshold and chain-split exposure: §3.4 models post-activation hashrate as a Bernoulli process and derives concrete reorganization probabilities — approximately thirty percent at E = 0.55 over a six-block horizon, falling to roughly 2×10⁻⁸ at E = 0.95. This quantification is consistent with </w:t>
+      </w:r>
+      <w:r>
+        <w:rPr>
+          <w:i/>
+          <w:iCs/>
+          <w:color w:val="333333"/>
+        </w:rPr>
+        <w:t xml:space="preserve">BCAP</w:t>
+      </w:r>
+      <w:r>
+        <w:rPr>
+          <w:color w:val="333333"/>
+        </w:rPr>
+        <w:t xml:space="preserve">’s qualitative conclusion that low and high Economic Node adoption produce categorically different risk profiles, but supplies the order-of-magnitude estimates that the qualitative analysis leaves open. Third, it develops a legal-liability framework — negligence (with explicit attention to the economic-loss rule and the available routes around it), tortious interference, fiduciary duty, mining-pool contract obligations, and regulatory consequences. </w:t>
+      </w:r>
+      <w:r>
+        <w:rPr>
+          <w:i/>
+          <w:iCs/>
+          <w:color w:val="333333"/>
+        </w:rPr>
+        <w:t xml:space="preserve">BCAP</w:t>
+      </w:r>
+      <w:r>
+        <w:rPr>
+          <w:color w:val="333333"/>
+        </w:rPr>
+        <w:t xml:space="preserve"> does not address legal exposure; this paper offers it as a distinct analytical layer whose conclusions are relevant to every stakeholder group </w:t>
+      </w:r>
+      <w:r>
+        <w:rPr>
+          <w:i/>
+          <w:iCs/>
+          <w:color w:val="333333"/>
+        </w:rPr>
+        <w:t xml:space="preserve">BCAP</w:t>
+      </w:r>
+      <w:r>
+        <w:rPr>
+          <w:color w:val="333333"/>
+        </w:rPr>
+        <w:t xml:space="preserve"> identifies. Fourth, it consolidates the foregoing into a binary twenty-point scoring rubric with classification bands (§5), enabling structured evaluation in place of free-form weighing of considerations.</w:t>
+      </w:r>
+    </w:p>
+    <w:p>
+      <w:pPr>
+        <w:jc w:val="both"/>
+      </w:pPr>
+      <w:r>
+        <w:rPr>
+          <w:color w:val="333333"/>
+        </w:rPr>
+        <w:t xml:space="preserve">Several elements of </w:t>
+      </w:r>
+      <w:r>
+        <w:rPr>
+          <w:i/>
+          <w:iCs/>
+          <w:color w:val="333333"/>
+        </w:rPr>
+        <w:t xml:space="preserve">BCAP</w:t>
+      </w:r>
+      <w:r>
+        <w:rPr>
+          <w:color w:val="333333"/>
+        </w:rPr>
+        <w:t xml:space="preserve"> the present paper does not duplicate. The stakeholder taxonomy and the power-over-time analysis (</w:t>
+      </w:r>
+      <w:r>
+        <w:rPr>
+          <w:i/>
+          <w:iCs/>
+          <w:color w:val="333333"/>
+        </w:rPr>
+        <w:t xml:space="preserve">BCAP</w:t>
+      </w:r>
+      <w:r>
+        <w:rPr>
+          <w:color w:val="333333"/>
+        </w:rPr>
+        <w:t xml:space="preserve"> §§3.2, 3.3.2), the State of Mind framework (</w:t>
+      </w:r>
+      <w:r>
+        <w:rPr>
+          <w:i/>
+          <w:iCs/>
+          <w:color w:val="333333"/>
+        </w:rPr>
+        <w:t xml:space="preserve">BCAP</w:t>
+      </w:r>
+      <w:r>
+        <w:rPr>
+          <w:color w:val="333333"/>
+        </w:rPr>
+        <w:t xml:space="preserve"> §3.1), the investor-segment analysis distinguishing self-custodying holders from institutional, corporate-treasury, and exchange-traded-fund segments (</w:t>
+      </w:r>
+      <w:r>
+        <w:rPr>
+          <w:i/>
+          <w:iCs/>
+          <w:color w:val="333333"/>
+        </w:rPr>
+        <w:t xml:space="preserve">BCAP</w:t>
+      </w:r>
+      <w:r>
+        <w:rPr>
+          <w:color w:val="333333"/>
+        </w:rPr>
+        <w:t xml:space="preserve"> §3.2.2), and the alternative-client adoption-pathway analysis (</w:t>
+      </w:r>
+      <w:r>
+        <w:rPr>
+          <w:i/>
+          <w:iCs/>
+          <w:color w:val="333333"/>
+        </w:rPr>
+        <w:t xml:space="preserve">BCAP</w:t>
+      </w:r>
+      <w:r>
+        <w:rPr>
+          <w:color w:val="333333"/>
+        </w:rPr>
+        <w:t xml:space="preserve"> §3.5.1) all remain the more developed treatments of their respective subjects. This paper refers readers to </w:t>
+      </w:r>
+      <w:r>
+        <w:rPr>
+          <w:i/>
+          <w:iCs/>
+          <w:color w:val="333333"/>
+        </w:rPr>
+        <w:t xml:space="preserve">BCAP</w:t>
+      </w:r>
+      <w:r>
+        <w:rPr>
+          <w:color w:val="333333"/>
+        </w:rPr>
+        <w:t xml:space="preserve"> for those questions. The two frameworks are intended to function together: </w:t>
+      </w:r>
+      <w:r>
+        <w:rPr>
+          <w:i/>
+          <w:iCs/>
+          <w:color w:val="333333"/>
+        </w:rPr>
+        <w:t xml:space="preserve">BCAP</w:t>
+      </w:r>
+      <w:r>
+        <w:rPr>
+          <w:color w:val="333333"/>
+        </w:rPr>
+        <w:t xml:space="preserve"> supplies the theory of how stakeholders shape consensus; this paper supplies the standards by which stakeholders may judge whether a particular proposal is ready for that process to begin.</w:t>
+      </w:r>
+    </w:p>
+    <w:p>
+      <w:pPr>
+        <w:jc w:val="both"/>
+      </w:pPr>
+      <w:r>
+        <w:rPr>
+          <w:color w:val="333333"/>
+        </w:rPr>
+        <w:t xml:space="preserve">The minimum-review-period floors proposed in §3.2 are anchored in empirical observation rather than aesthetic preference. Jameson Lopp’s longitudinal analysis of Bitcoin Core node-software adoption documents median upgrade times measured in months — historically on the order of forty weeks for routine releases, with recent versions trending longer still. </w:t>
+      </w:r>
+      <w:r>
+        <w:rPr>
+          <w:i/>
+          <w:iCs/>
+          <w:color w:val="333333"/>
+        </w:rPr>
+        <w:t xml:space="preserve">See </w:t>
+      </w:r>
+      <w:r>
+        <w:rPr>
+          <w:color w:val="333333"/>
+        </w:rPr>
+        <w:t xml:space="preserve">Jameson Lopp, </w:t>
+      </w:r>
+      <w:r>
+        <w:rPr>
+          <w:i/>
+          <w:iCs/>
+          <w:color w:val="333333"/>
+        </w:rPr>
+        <w:t xml:space="preserve">When Do Bitcoin Node Operators Upgrade?</w:t>
+      </w:r>
+      <w:r>
+        <w:rPr>
+          <w:color w:val="333333"/>
+        </w:rPr>
+        <w:t xml:space="preserve">, blog.lopp.net/when-do-bitcoin-node-operators-upgrade/. A twelve-month minimum review period for a moderate-risk soft fork accommodates a single such upgrade cycle plus a meaningful interval for review; a twenty-four-month minimum for a high-risk soft fork accommodates two. The review-period floors proposed in this framework are thus not arbitrary durations but the durations the network’s own observed upgrade dynamics require for activation signaling to begin from a position of broad enforcement readiness rather than speculative anticipation.</w:t>
+      </w:r>
+    </w:p>
+    <w:p>
+      <w:pPr>
+        <w:jc w:val="both"/>
+      </w:pPr>
+      <w:r>
+        <w:rPr>
+          <w:color w:val="333333"/>
+        </w:rPr>
+        <w:t xml:space="preserve">The legal analysis in Section 4 engages a smaller but distinct body of prior work. Angela Walch’s argument that core protocol developers exercise discretionary authority over property interests sufficient to trigger fiduciary obligations is the central academic contribution to the question and is engaged directly in the fiduciary-duty analysis below. The Tulip Trading litigation (</w:t>
+      </w:r>
+      <w:r>
+        <w:rPr>
+          <w:i/>
+          <w:iCs/>
+          <w:color w:val="333333"/>
+        </w:rPr>
         <w:t xml:space="preserve">Tulip Trading Ltd v van der Laan</w:t>
       </w:r>
       <w:r>
@@ -846,7 +1098,21 @@
         <w:rPr>
           <w:color w:val="333333"/>
         </w:rPr>
-        <w:t xml:space="preserve">This paper occupies the operational and legal layer of an emerging body of work on Bitcoin governance. It is most useful when read alongside BCAP, not in place of it.</w:t>
+        <w:t xml:space="preserve">This paper occupies the operational and legal layer of an emerging body of work on Bitcoin governance. It is most useful when read alongside </w:t>
+      </w:r>
+      <w:r>
+        <w:rPr>
+          <w:i/>
+          <w:iCs/>
+          <w:color w:val="333333"/>
+        </w:rPr>
+        <w:t xml:space="preserve">BCAP</w:t>
+      </w:r>
+      <w:r>
+        <w:rPr>
+          <w:color w:val="333333"/>
+        </w:rPr>
+        <w:t xml:space="preserve">, not in place of it.</w:t>
       </w:r>
     </w:p>
     <w:p>
@@ -2530,7 +2796,21 @@
         <w:rPr>
           <w:color w:val="333333"/>
         </w:rPr>
-        <w:t>A 55% threshold does not safely activate a soft fork. It produces the conditions historically associated with persistent minority chains: weeks or months of competing tips, ambiguous economic status for transactions confirmed on either side, and unresolved questions about the meaning of “Bitcoin” in contracts and on exchanges. The fact that P2SH used the same threshold in 2012 is not persuasive precedent: P2SH was a narrow, low-risk change to a network with a fraction of today’s value and user base. The stakes have changed. The standards must change with them. This conclusion is consistent with the qualitative analysis in BCAP §3.5.2, which identifies a low percentage of Economic Node enforcement as producing the highest risk of chain split and which describes the mechanism — sub-overwhelming enforcement permitting unupgraded blocks to extend the chain — by which that risk is realized.</w:t>
+        <w:t>A 55% threshold does not safely activate a soft fork. It produces the conditions historically associated with persistent minority chains: weeks or months of competing tips, ambiguous economic status for transactions confirmed on either side, and unresolved questions about the meaning of “Bitcoin” in contracts and on exchanges. The fact that P2SH used the same threshold in 2012 is not persuasive precedent: P2SH was a narrow, low-risk change to a network with a fraction of today’s value and user base. The stakes have changed. The standards must change with them. This conclusion is consistent with the qualitative analysis in </w:t>
+      </w:r>
+      <w:r>
+        <w:rPr>
+          <w:i/>
+          <w:iCs/>
+          <w:color w:val="333333"/>
+        </w:rPr>
+        <w:t>BCAP</w:t>
+      </w:r>
+      <w:r>
+        <w:rPr>
+          <w:color w:val="333333"/>
+        </w:rPr>
+        <w:t> §3.5.2, which identifies a low percentage of Economic Node enforcement as producing the highest risk of chain split and which describes the mechanism — sub-overwhelming enforcement permitting unupgraded blocks to extend the chain — by which that risk is realized.</w:t>
       </w:r>
     </w:p>
     <w:p>
@@ -2625,7 +2905,21 @@
         <w:rPr>
           <w:color w:val="333333"/>
         </w:rPr>
-        <w:t xml:space="preserve">The chain-split mechanisms this assessment must address are developed in detail in BCAP §3.5.2, including the bounty-claim scenario in which assets locked into scripts using newly proposed rules generate incentives for miners to mine an unupgraded block that voids the new-rule protection. Proposals that introduce new opcodes or new spending paths through OP_SUCCESS substitution warrant particular attention to that risk. The risk-assessment requirements that follow are the documentary correlates of that mechanism — questions a proponent must answer in writing before the community can rationally evaluate exposure.</w:t>
+        <w:t xml:space="preserve">The chain-split mechanisms this assessment must address are developed in detail in </w:t>
+      </w:r>
+      <w:r>
+        <w:rPr>
+          <w:i/>
+          <w:iCs/>
+          <w:color w:val="333333"/>
+        </w:rPr>
+        <w:t xml:space="preserve">BCAP</w:t>
+      </w:r>
+      <w:r>
+        <w:rPr>
+          <w:color w:val="333333"/>
+        </w:rPr>
+        <w:t xml:space="preserve"> §3.5.2, including the bounty-claim scenario in which assets locked into scripts using newly proposed rules generate incentives for miners to mine an unupgraded block that voids the new-rule protection. Proposals that introduce new opcodes or new spending paths through OP_SUCCESS substitution warrant particular attention to that risk. The risk-assessment requirements that follow are the documentary correlates of that mechanism — questions a proponent must answer in writing before the community can rationally evaluate exposure.</w:t>
       </w:r>
     </w:p>
     <w:p>
@@ -4103,7 +4397,21 @@
         <w:rPr>
           <w:color w:val="333333"/>
         </w:rPr>
-        <w:t>Bitcoin has no centralized governance. It has governance. Every consensus change that has ever been adopted required coordination among developers, miners, node operators, and economic actors. The process by which this coordination occurs — however informal — is governance. This framework does not propose centralized governance. It proposes minimum standards for evaluating proposals within Bitcoin’s existing decentralized governance structure. The descriptive thesis of BCAP — that Bitcoin consensus emerges from the iterated, multi-party interactions of stakeholders with shifting powers and incentives — is correct and is not contested by this framework. The framework’s claim is narrower and consistent with it: that minimum standards, publicly available and applied consistently, make the iterated process safer and more efficient by giving every stakeholder a shared vocabulary for declining engagement with proposals that are not ready.</w:t>
+        <w:t>Bitcoin has no centralized governance. It has governance. Every consensus change that has ever been adopted required coordination among developers, miners, node operators, and economic actors. The process by which this coordination occurs — however informal — is governance. This framework does not propose centralized governance. It proposes minimum standards for evaluating proposals within Bitcoin’s existing decentralized governance structure. The descriptive thesis of </w:t>
+      </w:r>
+      <w:r>
+        <w:rPr>
+          <w:i/>
+          <w:iCs/>
+          <w:color w:val="333333"/>
+        </w:rPr>
+        <w:t>BCAP</w:t>
+      </w:r>
+      <w:r>
+        <w:rPr>
+          <w:color w:val="333333"/>
+        </w:rPr>
+        <w:t> — that Bitcoin consensus emerges from the iterated, multi-party interactions of stakeholders with shifting powers and incentives — is correct and is not contested by this framework. The framework’s claim is narrower and consistent with it: that minimum standards, publicly available and applied consistently, make the iterated process safer and more efficient by giving every stakeholder a shared vocabulary for declining engagement with proposals that are not ready.</w:t>
       </w:r>
     </w:p>
     <w:p>

</xml_diff>